<commit_message>
feat(template/VB-S): Abschnitte angepasst, Psychologische Begleitung und Ressourcen/Risiken-Tabelle entfernt
</commit_message>
<xml_diff>
--- a/Templates/Verlaufsbericht-Stationaer_Template.docx
+++ b/Templates/Verlaufsbericht-Stationaer_Template.docx
@@ -830,7 +830,7 @@
           <w:sz w:val="24"/>
           <w:szCs w:val="24"/>
         </w:rPr>
-        <w:t>Gesundheitliche Versorgung</w:t>
+        <w:t>Gesundheitlicher Bereich</w:t>
       </w:r>
     </w:p>
     <w:p>
@@ -879,66 +879,7 @@
           <w:sz w:val="24"/>
           <w:szCs w:val="24"/>
         </w:rPr>
-        <w:lastRenderedPageBreak/>
         <w:t xml:space="preserve">3 I </w:t>
-      </w:r>
-      <w:r>
-        <w:rPr>
-          <w:rFonts w:eastAsiaTheme="majorEastAsia" w:cs="Kodchasan"/>
-          <w:color w:val="803300"/>
-          <w:sz w:val="24"/>
-          <w:szCs w:val="24"/>
-        </w:rPr>
-        <w:t>Psychologische Begleitung</w:t>
-      </w:r>
-    </w:p>
-    <w:p>
-      <w:pPr>
-        <w:pStyle w:val="Listenabsatz"/>
-        <w:spacing w:before="240" w:line="276" w:lineRule="auto"/>
-        <w:ind w:left="360"/>
-        <w:rPr>
-          <w:rFonts w:cs="Kodchasan"/>
-          <w:sz w:val="18"/>
-          <w:szCs w:val="18"/>
-        </w:rPr>
-      </w:pPr>
-      <w:r>
-        <w:rPr>
-          <w:rFonts w:cs="Kodchasan"/>
-          <w:sz w:val="18"/>
-          <w:szCs w:val="18"/>
-        </w:rPr>
-        <w:t>{{VBS_Psychologie}}</w:t>
-      </w:r>
-    </w:p>
-    <w:p>
-      <w:pPr>
-        <w:keepNext/>
-        <w:keepLines/>
-        <w:pBdr>
-          <w:top w:val="single" w:sz="4" w:space="1" w:color="auto"/>
-          <w:left w:val="single" w:sz="4" w:space="4" w:color="auto"/>
-          <w:bottom w:val="single" w:sz="4" w:space="1" w:color="auto"/>
-          <w:right w:val="single" w:sz="4" w:space="4" w:color="auto"/>
-        </w:pBdr>
-        <w:spacing w:before="240" w:after="0"/>
-        <w:outlineLvl w:val="0"/>
-        <w:rPr>
-          <w:rFonts w:eastAsiaTheme="majorEastAsia" w:cs="Kodchasan"/>
-          <w:color w:val="803300"/>
-          <w:sz w:val="24"/>
-          <w:szCs w:val="24"/>
-        </w:rPr>
-      </w:pPr>
-      <w:r>
-        <w:rPr>
-          <w:rFonts w:eastAsiaTheme="majorEastAsia" w:cs="Kodchasan"/>
-          <w:color w:val="803300"/>
-          <w:sz w:val="24"/>
-          <w:szCs w:val="24"/>
-        </w:rPr>
-        <w:t xml:space="preserve">4 I </w:t>
       </w:r>
       <w:r>
         <w:rPr>
@@ -996,7 +937,7 @@
           <w:sz w:val="24"/>
           <w:szCs w:val="24"/>
         </w:rPr>
-        <w:t xml:space="preserve">5 I </w:t>
+        <w:t xml:space="preserve">4 I </w:t>
       </w:r>
       <w:r>
         <w:rPr>
@@ -1005,7 +946,7 @@
           <w:sz w:val="24"/>
           <w:szCs w:val="24"/>
         </w:rPr>
-        <w:t>Deutsche Sprache und Integration</w:t>
+        <w:t>Sprachentwicklung</w:t>
       </w:r>
     </w:p>
     <w:p>
@@ -1054,7 +995,7 @@
           <w:sz w:val="24"/>
           <w:szCs w:val="24"/>
         </w:rPr>
-        <w:t>6</w:t>
+        <w:t>5</w:t>
       </w:r>
       <w:r>
         <w:rPr>
@@ -1121,7 +1062,7 @@
           <w:sz w:val="24"/>
           <w:szCs w:val="24"/>
         </w:rPr>
-        <w:t xml:space="preserve">5 I </w:t>
+        <w:t xml:space="preserve">6 I </w:t>
       </w:r>
       <w:r>
         <w:rPr>
@@ -1153,131 +1094,6 @@
         <w:t>{{VBS_Berufliche_Perspektive}}</w:t>
       </w:r>
     </w:p>
-    <w:p>
-      <w:pPr>
-        <w:spacing w:after="0"/>
-        <w:rPr>
-          <w:rFonts w:cs="Kodchasan"/>
-          <w:sz w:val="22"/>
-        </w:rPr>
-      </w:pPr>
-    </w:p>
-    <w:tbl>
-      <w:tblPr>
-        <w:tblStyle w:val="Tabellenraster"/>
-        <w:tblW w:w="0" w:type="auto"/>
-        <w:tblLook w:val="04A0" w:firstRow="1" w:lastRow="0" w:firstColumn="1" w:lastColumn="0" w:noHBand="0" w:noVBand="1"/>
-      </w:tblPr>
-      <w:tblGrid>
-        <w:gridCol w:w="4530"/>
-        <w:gridCol w:w="4530"/>
-      </w:tblGrid>
-      <w:tr>
-        <w:tc>
-          <w:tcPr>
-            <w:tcW w:w="4531" w:type="dxa"/>
-          </w:tcPr>
-          <w:p>
-            <w:pPr>
-              <w:jc w:val="both"/>
-              <w:rPr>
-                <w:rFonts w:cs="Kodchasan"/>
-                <w:sz w:val="24"/>
-                <w:szCs w:val="24"/>
-              </w:rPr>
-            </w:pPr>
-            <w:r>
-              <w:rPr>
-                <w:rFonts w:cs="Kodchasan"/>
-                <w:sz w:val="24"/>
-                <w:szCs w:val="24"/>
-              </w:rPr>
-              <w:t>Ressourcen</w:t>
-            </w:r>
-          </w:p>
-        </w:tc>
-        <w:tc>
-          <w:tcPr>
-            <w:tcW w:w="4531" w:type="dxa"/>
-          </w:tcPr>
-          <w:p>
-            <w:pPr>
-              <w:jc w:val="both"/>
-              <w:rPr>
-                <w:rFonts w:cs="Kodchasan"/>
-                <w:sz w:val="24"/>
-                <w:szCs w:val="24"/>
-              </w:rPr>
-            </w:pPr>
-            <w:r>
-              <w:rPr>
-                <w:rFonts w:cs="Kodchasan"/>
-                <w:sz w:val="24"/>
-                <w:szCs w:val="24"/>
-              </w:rPr>
-              <w:t>Risiken</w:t>
-            </w:r>
-          </w:p>
-        </w:tc>
-      </w:tr>
-      <w:tr>
-        <w:tc>
-          <w:tcPr>
-            <w:tcW w:w="4531" w:type="dxa"/>
-          </w:tcPr>
-          <w:p>
-            <w:pPr>
-              <w:pStyle w:val="Listenabsatz"/>
-              <w:spacing w:before="240" w:line="276" w:lineRule="auto"/>
-              <w:ind w:left="360"/>
-              <w:rPr>
-                <w:rFonts w:cs="Kodchasan"/>
-                <w:sz w:val="22"/>
-              </w:rPr>
-            </w:pPr>
-            <w:r>
-              <w:rPr>
-                <w:rFonts w:cs="Kodchasan"/>
-                <w:sz w:val="18"/>
-                <w:szCs w:val="18"/>
-              </w:rPr>
-              <w:t>{{Ressourcen}}</w:t>
-            </w:r>
-          </w:p>
-        </w:tc>
-        <w:tc>
-          <w:tcPr>
-            <w:tcW w:w="4531" w:type="dxa"/>
-          </w:tcPr>
-          <w:p>
-            <w:pPr>
-              <w:jc w:val="both"/>
-              <w:rPr>
-                <w:rFonts w:cs="Kodchasan"/>
-                <w:sz w:val="18"/>
-                <w:szCs w:val="18"/>
-              </w:rPr>
-            </w:pPr>
-            <w:r>
-              <w:rPr>
-                <w:rFonts w:cs="Kodchasan"/>
-                <w:sz w:val="18"/>
-                <w:szCs w:val="18"/>
-              </w:rPr>
-              <w:br/>
-            </w:r>
-            <w:r>
-              <w:rPr>
-                <w:rFonts w:cs="Kodchasan"/>
-                <w:sz w:val="18"/>
-                <w:szCs w:val="18"/>
-              </w:rPr>
-              <w:t>{{Risiken}}</w:t>
-            </w:r>
-          </w:p>
-        </w:tc>
-      </w:tr>
-    </w:tbl>
     <w:p>
       <w:pPr>
         <w:spacing w:after="0"/>

</xml_diff>